<commit_message>
feat: enhance contract generation with signature handling and feature prioritization
- Updated the contract generation process to include optional signature embedding for the landlord, improving document personalization.
- Enhanced the ContractsReservationSection and ContractPreviewModal to support selection and display of featured icons, prioritizing key amenities in contract outputs.
- Implemented validation for bank account resolution, ensuring accurate data handling and user feedback when accounts are not resolved.
- Refactored utility functions to streamline feature aggregation and improve amenity display logic, enhancing overall contract clarity.

These changes improve the functionality and user experience of contract generation, ensuring that key features and signatures are effectively managed.
</commit_message>
<xml_diff>
--- a/apps/web/assets/contracts/default-contract-template.docx
+++ b/apps/web/assets/contracts/default-contract-template.docx
@@ -1,6 +1,6 @@
 
 <file path=word/document.xml><?xml version="1.0" encoding="utf-8"?>
-<w:document xmlns:wpc="http://schemas.microsoft.com/office/word/2010/wordprocessingCanvas" xmlns:cx="http://schemas.microsoft.com/office/drawing/2014/chartex" xmlns:cx1="http://schemas.microsoft.com/office/drawing/2015/9/8/chartex" xmlns:cx2="http://schemas.microsoft.com/office/drawing/2015/10/21/chartex" xmlns:cx3="http://schemas.microsoft.com/office/drawing/2016/5/9/chartex" xmlns:cx4="http://schemas.microsoft.com/office/drawing/2016/5/10/chartex" xmlns:cx5="http://schemas.microsoft.com/office/drawing/2016/5/11/chartex" xmlns:cx6="http://schemas.microsoft.com/office/drawing/2016/5/12/chartex" xmlns:cx7="http://schemas.microsoft.com/office/drawing/2016/5/13/chartex" xmlns:cx8="http://schemas.microsoft.com/office/drawing/2016/5/14/chartex" xmlns:mc="http://schemas.openxmlformats.org/markup-compatibility/2006" xmlns:m="http://schemas.openxmlformats.org/officeDocument/2006/math" xmlns:aink="http://schemas.microsoft.com/office/drawing/2016/ink" xmlns:am3d="http://schemas.microsoft.com/office/drawing/2017/model3d" xmlns:oel="http://schemas.microsoft.com/office/2019/extlst" xmlns:r="http://schemas.openxmlformats.org/officeDocument/2006/relationships" xmlns:wp14="http://schemas.microsoft.com/office/word/2010/wordprocessingDrawing" xmlns:wp="http://schemas.openxmlformats.org/drawingml/2006/wordprocessingDrawing" xmlns:wpg="http://schemas.microsoft.com/office/word/2010/wordprocessingGroup" xmlns:wpi="http://schemas.microsoft.com/office/word/2010/wordprocessingInk" xmlns:wps="http://schemas.microsoft.com/office/word/2010/wordprocessingShape" xmlns:o="urn:schemas-microsoft-com:office:office" xmlns:v="urn:schemas-microsoft-com:vml" xmlns:w10="urn:schemas-microsoft-com:office:word" xmlns:w="http://schemas.openxmlformats.org/wordprocessingml/2006/main" xmlns:w14="http://schemas.microsoft.com/office/word/2010/wordml" xmlns:w15="http://schemas.microsoft.com/office/word/2012/wordml" xmlns:w16cex="http://schemas.microsoft.com/office/word/2018/wordml/cex" xmlns:w16cid="http://schemas.microsoft.com/office/word/2016/wordml/cid" xmlns:w16="http://schemas.microsoft.com/office/word/2018/wordml" xmlns:w16sdtdh="http://schemas.microsoft.com/office/word/2020/wordml/sdtdatahash" xmlns:w16sdtfl="http://schemas.microsoft.com/office/word/2024/wordml/sdtformatlock" xmlns:w16se="http://schemas.microsoft.com/office/word/2015/wordml/symex" xmlns:w16du="http://schemas.microsoft.com/office/word/2023/wordml/word16du" xmlns:wne="http://schemas.microsoft.com/office/word/2006/wordml" mc:Ignorable="w14 w15 w16se w16cid w16 w16cex w16sdtdh w16sdtfl w16du wp14">
+<w:document xmlns:wpc="http://schemas.microsoft.com/office/word/2010/wordprocessingCanvas" xmlns:cx="http://schemas.microsoft.com/office/drawing/2014/chartex" xmlns:cx1="http://schemas.microsoft.com/office/drawing/2015/9/8/chartex" xmlns:cx2="http://schemas.microsoft.com/office/drawing/2015/10/21/chartex" xmlns:cx3="http://schemas.microsoft.com/office/drawing/2016/5/9/chartex" xmlns:cx4="http://schemas.microsoft.com/office/drawing/2016/5/10/chartex" xmlns:cx5="http://schemas.microsoft.com/office/drawing/2016/5/11/chartex" xmlns:cx6="http://schemas.microsoft.com/office/drawing/2016/5/12/chartex" xmlns:cx7="http://schemas.microsoft.com/office/drawing/2016/5/13/chartex" xmlns:cx8="http://schemas.microsoft.com/office/drawing/2016/5/14/chartex" xmlns:mc="http://schemas.openxmlformats.org/markup-compatibility/2006" xmlns:m="http://schemas.openxmlformats.org/officeDocument/2006/math" xmlns:aink="http://schemas.microsoft.com/office/drawing/2016/ink" xmlns:am3d="http://schemas.microsoft.com/office/drawing/2017/model3d" xmlns:oel="http://schemas.microsoft.com/office/2019/extlst" xmlns:r="http://schemas.openxmlformats.org/officeDocument/2006/relationships" xmlns:wp14="http://schemas.microsoft.com/office/word/2010/wordprocessingDrawing" xmlns:wp="http://schemas.openxmlformats.org/drawingml/2006/wordprocessingDrawing" xmlns:wpg="http://schemas.microsoft.com/office/word/2010/wordprocessingGroup" xmlns:wpi="http://schemas.microsoft.com/office/word/2010/wordprocessingInk" xmlns:wps="http://schemas.microsoft.com/office/word/2010/wordprocessingShape" xmlns:o="urn:schemas-microsoft-com:office:office" xmlns:v="urn:schemas-microsoft-com:vml" xmlns:w10="urn:schemas-microsoft-com:office:word" xmlns:w="http://schemas.openxmlformats.org/wordprocessingml/2006/main" xmlns:w14="http://schemas.microsoft.com/office/word/2010/wordml" xmlns:w15="http://schemas.microsoft.com/office/word/2012/wordml" xmlns:w16cei="http://schemas.microsoft.com/office/word/2026/wordml/cei" xmlns:w16cex="http://schemas.microsoft.com/office/word/2018/wordml/cex" xmlns:w16cid="http://schemas.microsoft.com/office/word/2016/wordml/cid" xmlns:w16="http://schemas.microsoft.com/office/word/2018/wordml" xmlns:w16sdtdh="http://schemas.microsoft.com/office/word/2020/wordml/sdtdatahash" xmlns:w16sdtfl="http://schemas.microsoft.com/office/word/2024/wordml/sdtformatlock" xmlns:w16se="http://schemas.microsoft.com/office/word/2015/wordml/symex" xmlns:w16du="http://schemas.microsoft.com/office/word/2023/wordml/word16du" xmlns:wne="http://schemas.microsoft.com/office/word/2006/wordml" mc:Ignorable="w14 w15 w16se w16cid w16 w16cex w16sdtdh w16sdtfl w16du wp14">
   <w:body>
     <w:p>
       <w:pPr>
@@ -1986,7 +1986,7 @@
     </w:p>
     <w:p>
       <w:pPr>
-        <w:pStyle w:val="ListParagraph"/>
+        <w:pStyle w:val="Prrafodelista"/>
         <w:numPr>
           <w:ilvl w:val="0"/>
           <w:numId w:val="2"/>
@@ -1998,7 +1998,7 @@
     </w:p>
     <w:p>
       <w:pPr>
-        <w:pStyle w:val="ListParagraph"/>
+        <w:pStyle w:val="Prrafodelista"/>
         <w:numPr>
           <w:ilvl w:val="0"/>
           <w:numId w:val="2"/>
@@ -2066,7 +2066,7 @@
     </w:p>
     <w:p>
       <w:pPr>
-        <w:pStyle w:val="ListParagraph"/>
+        <w:pStyle w:val="Prrafodelista"/>
         <w:numPr>
           <w:ilvl w:val="0"/>
           <w:numId w:val="2"/>
@@ -2078,7 +2078,7 @@
     </w:p>
     <w:p>
       <w:pPr>
-        <w:pStyle w:val="ListParagraph"/>
+        <w:pStyle w:val="Prrafodelista"/>
         <w:numPr>
           <w:ilvl w:val="0"/>
           <w:numId w:val="2"/>
@@ -2090,7 +2090,7 @@
     </w:p>
     <w:p>
       <w:pPr>
-        <w:pStyle w:val="ListParagraph"/>
+        <w:pStyle w:val="Prrafodelista"/>
         <w:numPr>
           <w:ilvl w:val="0"/>
           <w:numId w:val="2"/>
@@ -2110,7 +2110,7 @@
     </w:p>
     <w:p>
       <w:pPr>
-        <w:pStyle w:val="ListParagraph"/>
+        <w:pStyle w:val="Prrafodelista"/>
         <w:numPr>
           <w:ilvl w:val="0"/>
           <w:numId w:val="2"/>
@@ -2187,7 +2187,7 @@
     </w:p>
     <w:p>
       <w:pPr>
-        <w:pStyle w:val="ListParagraph"/>
+        <w:pStyle w:val="Prrafodelista"/>
         <w:numPr>
           <w:ilvl w:val="0"/>
           <w:numId w:val="2"/>
@@ -2252,7 +2252,7 @@
     </w:p>
     <w:p>
       <w:pPr>
-        <w:pStyle w:val="ListParagraph"/>
+        <w:pStyle w:val="Prrafodelista"/>
         <w:numPr>
           <w:ilvl w:val="0"/>
           <w:numId w:val="2"/>
@@ -2264,7 +2264,7 @@
     </w:p>
     <w:p>
       <w:pPr>
-        <w:pStyle w:val="ListParagraph"/>
+        <w:pStyle w:val="Prrafodelista"/>
         <w:numPr>
           <w:ilvl w:val="0"/>
           <w:numId w:val="2"/>
@@ -2276,7 +2276,7 @@
     </w:p>
     <w:p>
       <w:pPr>
-        <w:pStyle w:val="ListParagraph"/>
+        <w:pStyle w:val="Prrafodelista"/>
         <w:numPr>
           <w:ilvl w:val="0"/>
           <w:numId w:val="2"/>
@@ -2288,7 +2288,7 @@
     </w:p>
     <w:p>
       <w:pPr>
-        <w:pStyle w:val="ListParagraph"/>
+        <w:pStyle w:val="Prrafodelista"/>
         <w:numPr>
           <w:ilvl w:val="0"/>
           <w:numId w:val="2"/>
@@ -2301,7 +2301,7 @@
     </w:p>
     <w:p>
       <w:pPr>
-        <w:pStyle w:val="ListParagraph"/>
+        <w:pStyle w:val="Prrafodelista"/>
         <w:numPr>
           <w:ilvl w:val="0"/>
           <w:numId w:val="2"/>
@@ -2313,7 +2313,7 @@
     </w:p>
     <w:p>
       <w:pPr>
-        <w:pStyle w:val="ListParagraph"/>
+        <w:pStyle w:val="Prrafodelista"/>
         <w:numPr>
           <w:ilvl w:val="0"/>
           <w:numId w:val="2"/>
@@ -2325,7 +2325,7 @@
     </w:p>
     <w:p>
       <w:pPr>
-        <w:pStyle w:val="ListParagraph"/>
+        <w:pStyle w:val="Prrafodelista"/>
         <w:numPr>
           <w:ilvl w:val="0"/>
           <w:numId w:val="2"/>
@@ -2337,7 +2337,7 @@
     </w:p>
     <w:p>
       <w:pPr>
-        <w:pStyle w:val="ListParagraph"/>
+        <w:pStyle w:val="Prrafodelista"/>
         <w:numPr>
           <w:ilvl w:val="0"/>
           <w:numId w:val="2"/>
@@ -2668,9 +2668,20 @@
     <w:p>
       <w:pPr>
         <w:ind w:left="550"/>
+        <w:rPr>
+          <w:b/>
+          <w:bCs/>
+        </w:rPr>
       </w:pPr>
       <w:r>
         <w:t xml:space="preserve">  </w:t>
+      </w:r>
+      <w:r>
+        <w:rPr>
+          <w:b/>
+          <w:bCs/>
+        </w:rPr>
+        <w:t>{{Firma}}</w:t>
       </w:r>
     </w:p>
     <w:p>
@@ -3058,7 +3069,7 @@
 </file>
 
 <file path=word/endnotes.xml><?xml version="1.0" encoding="utf-8"?>
-<w:endnotes xmlns:wpc="http://schemas.microsoft.com/office/word/2010/wordprocessingCanvas" xmlns:cx="http://schemas.microsoft.com/office/drawing/2014/chartex" xmlns:cx1="http://schemas.microsoft.com/office/drawing/2015/9/8/chartex" xmlns:cx2="http://schemas.microsoft.com/office/drawing/2015/10/21/chartex" xmlns:cx3="http://schemas.microsoft.com/office/drawing/2016/5/9/chartex" xmlns:cx4="http://schemas.microsoft.com/office/drawing/2016/5/10/chartex" xmlns:cx5="http://schemas.microsoft.com/office/drawing/2016/5/11/chartex" xmlns:cx6="http://schemas.microsoft.com/office/drawing/2016/5/12/chartex" xmlns:cx7="http://schemas.microsoft.com/office/drawing/2016/5/13/chartex" xmlns:cx8="http://schemas.microsoft.com/office/drawing/2016/5/14/chartex" xmlns:mc="http://schemas.openxmlformats.org/markup-compatibility/2006" xmlns:m="http://schemas.openxmlformats.org/officeDocument/2006/math" xmlns:aink="http://schemas.microsoft.com/office/drawing/2016/ink" xmlns:am3d="http://schemas.microsoft.com/office/drawing/2017/model3d" xmlns:oel="http://schemas.microsoft.com/office/2019/extlst" xmlns:r="http://schemas.openxmlformats.org/officeDocument/2006/relationships" xmlns:wp14="http://schemas.microsoft.com/office/word/2010/wordprocessingDrawing" xmlns:wp="http://schemas.openxmlformats.org/drawingml/2006/wordprocessingDrawing" xmlns:wpg="http://schemas.microsoft.com/office/word/2010/wordprocessingGroup" xmlns:wpi="http://schemas.microsoft.com/office/word/2010/wordprocessingInk" xmlns:wps="http://schemas.microsoft.com/office/word/2010/wordprocessingShape" xmlns:o="urn:schemas-microsoft-com:office:office" xmlns:v="urn:schemas-microsoft-com:vml" xmlns:w10="urn:schemas-microsoft-com:office:word" xmlns:w="http://schemas.openxmlformats.org/wordprocessingml/2006/main" xmlns:w14="http://schemas.microsoft.com/office/word/2010/wordml" xmlns:w15="http://schemas.microsoft.com/office/word/2012/wordml" xmlns:w16cex="http://schemas.microsoft.com/office/word/2018/wordml/cex" xmlns:w16cid="http://schemas.microsoft.com/office/word/2016/wordml/cid" xmlns:w16="http://schemas.microsoft.com/office/word/2018/wordml" xmlns:w16sdtdh="http://schemas.microsoft.com/office/word/2020/wordml/sdtdatahash" xmlns:w16sdtfl="http://schemas.microsoft.com/office/word/2024/wordml/sdtformatlock" xmlns:w16se="http://schemas.microsoft.com/office/word/2015/wordml/symex" xmlns:w16du="http://schemas.microsoft.com/office/word/2023/wordml/word16du" xmlns:wne="http://schemas.microsoft.com/office/word/2006/wordml" mc:Ignorable="w14 w15 w16se w16cid w16 w16cex w16sdtdh w16sdtfl w16du wp14">
+<w:endnotes xmlns:wpc="http://schemas.microsoft.com/office/word/2010/wordprocessingCanvas" xmlns:cx="http://schemas.microsoft.com/office/drawing/2014/chartex" xmlns:cx1="http://schemas.microsoft.com/office/drawing/2015/9/8/chartex" xmlns:cx2="http://schemas.microsoft.com/office/drawing/2015/10/21/chartex" xmlns:cx3="http://schemas.microsoft.com/office/drawing/2016/5/9/chartex" xmlns:cx4="http://schemas.microsoft.com/office/drawing/2016/5/10/chartex" xmlns:cx5="http://schemas.microsoft.com/office/drawing/2016/5/11/chartex" xmlns:cx6="http://schemas.microsoft.com/office/drawing/2016/5/12/chartex" xmlns:cx7="http://schemas.microsoft.com/office/drawing/2016/5/13/chartex" xmlns:cx8="http://schemas.microsoft.com/office/drawing/2016/5/14/chartex" xmlns:mc="http://schemas.openxmlformats.org/markup-compatibility/2006" xmlns:m="http://schemas.openxmlformats.org/officeDocument/2006/math" xmlns:aink="http://schemas.microsoft.com/office/drawing/2016/ink" xmlns:am3d="http://schemas.microsoft.com/office/drawing/2017/model3d" xmlns:oel="http://schemas.microsoft.com/office/2019/extlst" xmlns:r="http://schemas.openxmlformats.org/officeDocument/2006/relationships" xmlns:wp14="http://schemas.microsoft.com/office/word/2010/wordprocessingDrawing" xmlns:wp="http://schemas.openxmlformats.org/drawingml/2006/wordprocessingDrawing" xmlns:wpg="http://schemas.microsoft.com/office/word/2010/wordprocessingGroup" xmlns:wpi="http://schemas.microsoft.com/office/word/2010/wordprocessingInk" xmlns:wps="http://schemas.microsoft.com/office/word/2010/wordprocessingShape" xmlns:o="urn:schemas-microsoft-com:office:office" xmlns:v="urn:schemas-microsoft-com:vml" xmlns:w10="urn:schemas-microsoft-com:office:word" xmlns:w="http://schemas.openxmlformats.org/wordprocessingml/2006/main" xmlns:w14="http://schemas.microsoft.com/office/word/2010/wordml" xmlns:w15="http://schemas.microsoft.com/office/word/2012/wordml" xmlns:w16cei="http://schemas.microsoft.com/office/word/2026/wordml/cei" xmlns:w16cex="http://schemas.microsoft.com/office/word/2018/wordml/cex" xmlns:w16cid="http://schemas.microsoft.com/office/word/2016/wordml/cid" xmlns:w16="http://schemas.microsoft.com/office/word/2018/wordml" xmlns:w16sdtdh="http://schemas.microsoft.com/office/word/2020/wordml/sdtdatahash" xmlns:w16sdtfl="http://schemas.microsoft.com/office/word/2024/wordml/sdtformatlock" xmlns:w16se="http://schemas.microsoft.com/office/word/2015/wordml/symex" xmlns:w16du="http://schemas.microsoft.com/office/word/2023/wordml/word16du" xmlns:wne="http://schemas.microsoft.com/office/word/2006/wordml" mc:Ignorable="w14 w15 w16se w16cid w16 w16cex w16sdtdh w16sdtfl w16du wp14">
   <w:endnote w:type="separator" w:id="-1">
     <w:p>
       <w:pPr>
@@ -3083,7 +3094,7 @@
 </file>
 
 <file path=word/footer1.xml><?xml version="1.0" encoding="utf-8"?>
-<w:ftr xmlns:wpc="http://schemas.microsoft.com/office/word/2010/wordprocessingCanvas" xmlns:cx="http://schemas.microsoft.com/office/drawing/2014/chartex" xmlns:cx1="http://schemas.microsoft.com/office/drawing/2015/9/8/chartex" xmlns:cx2="http://schemas.microsoft.com/office/drawing/2015/10/21/chartex" xmlns:cx3="http://schemas.microsoft.com/office/drawing/2016/5/9/chartex" xmlns:cx4="http://schemas.microsoft.com/office/drawing/2016/5/10/chartex" xmlns:cx5="http://schemas.microsoft.com/office/drawing/2016/5/11/chartex" xmlns:cx6="http://schemas.microsoft.com/office/drawing/2016/5/12/chartex" xmlns:cx7="http://schemas.microsoft.com/office/drawing/2016/5/13/chartex" xmlns:cx8="http://schemas.microsoft.com/office/drawing/2016/5/14/chartex" xmlns:mc="http://schemas.openxmlformats.org/markup-compatibility/2006" xmlns:m="http://schemas.openxmlformats.org/officeDocument/2006/math" xmlns:aink="http://schemas.microsoft.com/office/drawing/2016/ink" xmlns:am3d="http://schemas.microsoft.com/office/drawing/2017/model3d" xmlns:oel="http://schemas.microsoft.com/office/2019/extlst" xmlns:r="http://schemas.openxmlformats.org/officeDocument/2006/relationships" xmlns:wp14="http://schemas.microsoft.com/office/word/2010/wordprocessingDrawing" xmlns:wp="http://schemas.openxmlformats.org/drawingml/2006/wordprocessingDrawing" xmlns:wpg="http://schemas.microsoft.com/office/word/2010/wordprocessingGroup" xmlns:wpi="http://schemas.microsoft.com/office/word/2010/wordprocessingInk" xmlns:wps="http://schemas.microsoft.com/office/word/2010/wordprocessingShape" xmlns:o="urn:schemas-microsoft-com:office:office" xmlns:v="urn:schemas-microsoft-com:vml" xmlns:w10="urn:schemas-microsoft-com:office:word" xmlns:w="http://schemas.openxmlformats.org/wordprocessingml/2006/main" xmlns:w14="http://schemas.microsoft.com/office/word/2010/wordml" xmlns:w15="http://schemas.microsoft.com/office/word/2012/wordml" xmlns:w16cex="http://schemas.microsoft.com/office/word/2018/wordml/cex" xmlns:w16cid="http://schemas.microsoft.com/office/word/2016/wordml/cid" xmlns:w16="http://schemas.microsoft.com/office/word/2018/wordml" xmlns:w16sdtdh="http://schemas.microsoft.com/office/word/2020/wordml/sdtdatahash" xmlns:w16sdtfl="http://schemas.microsoft.com/office/word/2024/wordml/sdtformatlock" xmlns:w16se="http://schemas.microsoft.com/office/word/2015/wordml/symex" xmlns:w16du="http://schemas.microsoft.com/office/word/2023/wordml/word16du" xmlns:wne="http://schemas.microsoft.com/office/word/2006/wordml" mc:Ignorable="w14 w15 w16se w16cid w16 w16cex w16sdtdh w16sdtfl w16du wp14">
+<w:ftr xmlns:wpc="http://schemas.microsoft.com/office/word/2010/wordprocessingCanvas" xmlns:cx="http://schemas.microsoft.com/office/drawing/2014/chartex" xmlns:cx1="http://schemas.microsoft.com/office/drawing/2015/9/8/chartex" xmlns:cx2="http://schemas.microsoft.com/office/drawing/2015/10/21/chartex" xmlns:cx3="http://schemas.microsoft.com/office/drawing/2016/5/9/chartex" xmlns:cx4="http://schemas.microsoft.com/office/drawing/2016/5/10/chartex" xmlns:cx5="http://schemas.microsoft.com/office/drawing/2016/5/11/chartex" xmlns:cx6="http://schemas.microsoft.com/office/drawing/2016/5/12/chartex" xmlns:cx7="http://schemas.microsoft.com/office/drawing/2016/5/13/chartex" xmlns:cx8="http://schemas.microsoft.com/office/drawing/2016/5/14/chartex" xmlns:mc="http://schemas.openxmlformats.org/markup-compatibility/2006" xmlns:m="http://schemas.openxmlformats.org/officeDocument/2006/math" xmlns:aink="http://schemas.microsoft.com/office/drawing/2016/ink" xmlns:am3d="http://schemas.microsoft.com/office/drawing/2017/model3d" xmlns:oel="http://schemas.microsoft.com/office/2019/extlst" xmlns:r="http://schemas.openxmlformats.org/officeDocument/2006/relationships" xmlns:wp14="http://schemas.microsoft.com/office/word/2010/wordprocessingDrawing" xmlns:wp="http://schemas.openxmlformats.org/drawingml/2006/wordprocessingDrawing" xmlns:wpg="http://schemas.microsoft.com/office/word/2010/wordprocessingGroup" xmlns:wpi="http://schemas.microsoft.com/office/word/2010/wordprocessingInk" xmlns:wps="http://schemas.microsoft.com/office/word/2010/wordprocessingShape" xmlns:o="urn:schemas-microsoft-com:office:office" xmlns:v="urn:schemas-microsoft-com:vml" xmlns:w10="urn:schemas-microsoft-com:office:word" xmlns:w="http://schemas.openxmlformats.org/wordprocessingml/2006/main" xmlns:w14="http://schemas.microsoft.com/office/word/2010/wordml" xmlns:w15="http://schemas.microsoft.com/office/word/2012/wordml" xmlns:w16cei="http://schemas.microsoft.com/office/word/2026/wordml/cei" xmlns:w16cex="http://schemas.microsoft.com/office/word/2018/wordml/cex" xmlns:w16cid="http://schemas.microsoft.com/office/word/2016/wordml/cid" xmlns:w16="http://schemas.microsoft.com/office/word/2018/wordml" xmlns:w16sdtdh="http://schemas.microsoft.com/office/word/2020/wordml/sdtdatahash" xmlns:w16sdtfl="http://schemas.microsoft.com/office/word/2024/wordml/sdtformatlock" xmlns:w16se="http://schemas.microsoft.com/office/word/2015/wordml/symex" xmlns:w16du="http://schemas.microsoft.com/office/word/2023/wordml/word16du" xmlns:wne="http://schemas.microsoft.com/office/word/2006/wordml" mc:Ignorable="w14 w15 w16se w16cid w16 w16cex w16sdtdh w16sdtfl w16du wp14">
   <w:p>
     <w:pPr>
       <w:spacing w:after="0" w:line="259" w:lineRule="auto"/>
@@ -3105,7 +3116,7 @@
 </file>
 
 <file path=word/footer2.xml><?xml version="1.0" encoding="utf-8"?>
-<w:ftr xmlns:wpc="http://schemas.microsoft.com/office/word/2010/wordprocessingCanvas" xmlns:cx="http://schemas.microsoft.com/office/drawing/2014/chartex" xmlns:cx1="http://schemas.microsoft.com/office/drawing/2015/9/8/chartex" xmlns:cx2="http://schemas.microsoft.com/office/drawing/2015/10/21/chartex" xmlns:cx3="http://schemas.microsoft.com/office/drawing/2016/5/9/chartex" xmlns:cx4="http://schemas.microsoft.com/office/drawing/2016/5/10/chartex" xmlns:cx5="http://schemas.microsoft.com/office/drawing/2016/5/11/chartex" xmlns:cx6="http://schemas.microsoft.com/office/drawing/2016/5/12/chartex" xmlns:cx7="http://schemas.microsoft.com/office/drawing/2016/5/13/chartex" xmlns:cx8="http://schemas.microsoft.com/office/drawing/2016/5/14/chartex" xmlns:mc="http://schemas.openxmlformats.org/markup-compatibility/2006" xmlns:m="http://schemas.openxmlformats.org/officeDocument/2006/math" xmlns:aink="http://schemas.microsoft.com/office/drawing/2016/ink" xmlns:am3d="http://schemas.microsoft.com/office/drawing/2017/model3d" xmlns:oel="http://schemas.microsoft.com/office/2019/extlst" xmlns:r="http://schemas.openxmlformats.org/officeDocument/2006/relationships" xmlns:wp14="http://schemas.microsoft.com/office/word/2010/wordprocessingDrawing" xmlns:wp="http://schemas.openxmlformats.org/drawingml/2006/wordprocessingDrawing" xmlns:wpg="http://schemas.microsoft.com/office/word/2010/wordprocessingGroup" xmlns:wpi="http://schemas.microsoft.com/office/word/2010/wordprocessingInk" xmlns:wps="http://schemas.microsoft.com/office/word/2010/wordprocessingShape" xmlns:o="urn:schemas-microsoft-com:office:office" xmlns:v="urn:schemas-microsoft-com:vml" xmlns:w10="urn:schemas-microsoft-com:office:word" xmlns:w="http://schemas.openxmlformats.org/wordprocessingml/2006/main" xmlns:w14="http://schemas.microsoft.com/office/word/2010/wordml" xmlns:w15="http://schemas.microsoft.com/office/word/2012/wordml" xmlns:w16cex="http://schemas.microsoft.com/office/word/2018/wordml/cex" xmlns:w16cid="http://schemas.microsoft.com/office/word/2016/wordml/cid" xmlns:w16="http://schemas.microsoft.com/office/word/2018/wordml" xmlns:w16sdtdh="http://schemas.microsoft.com/office/word/2020/wordml/sdtdatahash" xmlns:w16sdtfl="http://schemas.microsoft.com/office/word/2024/wordml/sdtformatlock" xmlns:w16se="http://schemas.microsoft.com/office/word/2015/wordml/symex" xmlns:w16du="http://schemas.microsoft.com/office/word/2023/wordml/word16du" xmlns:wne="http://schemas.microsoft.com/office/word/2006/wordml" mc:Ignorable="w14 w15 w16se w16cid w16 w16cex w16sdtdh w16sdtfl w16du wp14">
+<w:ftr xmlns:wpc="http://schemas.microsoft.com/office/word/2010/wordprocessingCanvas" xmlns:cx="http://schemas.microsoft.com/office/drawing/2014/chartex" xmlns:cx1="http://schemas.microsoft.com/office/drawing/2015/9/8/chartex" xmlns:cx2="http://schemas.microsoft.com/office/drawing/2015/10/21/chartex" xmlns:cx3="http://schemas.microsoft.com/office/drawing/2016/5/9/chartex" xmlns:cx4="http://schemas.microsoft.com/office/drawing/2016/5/10/chartex" xmlns:cx5="http://schemas.microsoft.com/office/drawing/2016/5/11/chartex" xmlns:cx6="http://schemas.microsoft.com/office/drawing/2016/5/12/chartex" xmlns:cx7="http://schemas.microsoft.com/office/drawing/2016/5/13/chartex" xmlns:cx8="http://schemas.microsoft.com/office/drawing/2016/5/14/chartex" xmlns:mc="http://schemas.openxmlformats.org/markup-compatibility/2006" xmlns:m="http://schemas.openxmlformats.org/officeDocument/2006/math" xmlns:aink="http://schemas.microsoft.com/office/drawing/2016/ink" xmlns:am3d="http://schemas.microsoft.com/office/drawing/2017/model3d" xmlns:oel="http://schemas.microsoft.com/office/2019/extlst" xmlns:r="http://schemas.openxmlformats.org/officeDocument/2006/relationships" xmlns:wp14="http://schemas.microsoft.com/office/word/2010/wordprocessingDrawing" xmlns:wp="http://schemas.openxmlformats.org/drawingml/2006/wordprocessingDrawing" xmlns:wpg="http://schemas.microsoft.com/office/word/2010/wordprocessingGroup" xmlns:wpi="http://schemas.microsoft.com/office/word/2010/wordprocessingInk" xmlns:wps="http://schemas.microsoft.com/office/word/2010/wordprocessingShape" xmlns:o="urn:schemas-microsoft-com:office:office" xmlns:v="urn:schemas-microsoft-com:vml" xmlns:w10="urn:schemas-microsoft-com:office:word" xmlns:w="http://schemas.openxmlformats.org/wordprocessingml/2006/main" xmlns:w14="http://schemas.microsoft.com/office/word/2010/wordml" xmlns:w15="http://schemas.microsoft.com/office/word/2012/wordml" xmlns:w16cei="http://schemas.microsoft.com/office/word/2026/wordml/cei" xmlns:w16cex="http://schemas.microsoft.com/office/word/2018/wordml/cex" xmlns:w16cid="http://schemas.microsoft.com/office/word/2016/wordml/cid" xmlns:w16="http://schemas.microsoft.com/office/word/2018/wordml" xmlns:w16sdtdh="http://schemas.microsoft.com/office/word/2020/wordml/sdtdatahash" xmlns:w16sdtfl="http://schemas.microsoft.com/office/word/2024/wordml/sdtformatlock" xmlns:w16se="http://schemas.microsoft.com/office/word/2015/wordml/symex" xmlns:w16du="http://schemas.microsoft.com/office/word/2023/wordml/word16du" xmlns:wne="http://schemas.microsoft.com/office/word/2006/wordml" mc:Ignorable="w14 w15 w16se w16cid w16 w16cex w16sdtdh w16sdtfl w16du wp14">
   <w:p>
     <w:pPr>
       <w:spacing w:after="0" w:line="259" w:lineRule="auto"/>
@@ -3127,7 +3138,7 @@
 </file>
 
 <file path=word/footer3.xml><?xml version="1.0" encoding="utf-8"?>
-<w:ftr xmlns:wpc="http://schemas.microsoft.com/office/word/2010/wordprocessingCanvas" xmlns:cx="http://schemas.microsoft.com/office/drawing/2014/chartex" xmlns:cx1="http://schemas.microsoft.com/office/drawing/2015/9/8/chartex" xmlns:cx2="http://schemas.microsoft.com/office/drawing/2015/10/21/chartex" xmlns:cx3="http://schemas.microsoft.com/office/drawing/2016/5/9/chartex" xmlns:cx4="http://schemas.microsoft.com/office/drawing/2016/5/10/chartex" xmlns:cx5="http://schemas.microsoft.com/office/drawing/2016/5/11/chartex" xmlns:cx6="http://schemas.microsoft.com/office/drawing/2016/5/12/chartex" xmlns:cx7="http://schemas.microsoft.com/office/drawing/2016/5/13/chartex" xmlns:cx8="http://schemas.microsoft.com/office/drawing/2016/5/14/chartex" xmlns:mc="http://schemas.openxmlformats.org/markup-compatibility/2006" xmlns:m="http://schemas.openxmlformats.org/officeDocument/2006/math" xmlns:aink="http://schemas.microsoft.com/office/drawing/2016/ink" xmlns:am3d="http://schemas.microsoft.com/office/drawing/2017/model3d" xmlns:oel="http://schemas.microsoft.com/office/2019/extlst" xmlns:r="http://schemas.openxmlformats.org/officeDocument/2006/relationships" xmlns:wp14="http://schemas.microsoft.com/office/word/2010/wordprocessingDrawing" xmlns:wp="http://schemas.openxmlformats.org/drawingml/2006/wordprocessingDrawing" xmlns:wpg="http://schemas.microsoft.com/office/word/2010/wordprocessingGroup" xmlns:wpi="http://schemas.microsoft.com/office/word/2010/wordprocessingInk" xmlns:wps="http://schemas.microsoft.com/office/word/2010/wordprocessingShape" xmlns:o="urn:schemas-microsoft-com:office:office" xmlns:v="urn:schemas-microsoft-com:vml" xmlns:w10="urn:schemas-microsoft-com:office:word" xmlns:w="http://schemas.openxmlformats.org/wordprocessingml/2006/main" xmlns:w14="http://schemas.microsoft.com/office/word/2010/wordml" xmlns:w15="http://schemas.microsoft.com/office/word/2012/wordml" xmlns:w16cex="http://schemas.microsoft.com/office/word/2018/wordml/cex" xmlns:w16cid="http://schemas.microsoft.com/office/word/2016/wordml/cid" xmlns:w16="http://schemas.microsoft.com/office/word/2018/wordml" xmlns:w16sdtdh="http://schemas.microsoft.com/office/word/2020/wordml/sdtdatahash" xmlns:w16sdtfl="http://schemas.microsoft.com/office/word/2024/wordml/sdtformatlock" xmlns:w16se="http://schemas.microsoft.com/office/word/2015/wordml/symex" xmlns:w16du="http://schemas.microsoft.com/office/word/2023/wordml/word16du" xmlns:wne="http://schemas.microsoft.com/office/word/2006/wordml" mc:Ignorable="w14 w15 w16se w16cid w16 w16cex w16sdtdh w16sdtfl w16du wp14">
+<w:ftr xmlns:wpc="http://schemas.microsoft.com/office/word/2010/wordprocessingCanvas" xmlns:cx="http://schemas.microsoft.com/office/drawing/2014/chartex" xmlns:cx1="http://schemas.microsoft.com/office/drawing/2015/9/8/chartex" xmlns:cx2="http://schemas.microsoft.com/office/drawing/2015/10/21/chartex" xmlns:cx3="http://schemas.microsoft.com/office/drawing/2016/5/9/chartex" xmlns:cx4="http://schemas.microsoft.com/office/drawing/2016/5/10/chartex" xmlns:cx5="http://schemas.microsoft.com/office/drawing/2016/5/11/chartex" xmlns:cx6="http://schemas.microsoft.com/office/drawing/2016/5/12/chartex" xmlns:cx7="http://schemas.microsoft.com/office/drawing/2016/5/13/chartex" xmlns:cx8="http://schemas.microsoft.com/office/drawing/2016/5/14/chartex" xmlns:mc="http://schemas.openxmlformats.org/markup-compatibility/2006" xmlns:m="http://schemas.openxmlformats.org/officeDocument/2006/math" xmlns:aink="http://schemas.microsoft.com/office/drawing/2016/ink" xmlns:am3d="http://schemas.microsoft.com/office/drawing/2017/model3d" xmlns:oel="http://schemas.microsoft.com/office/2019/extlst" xmlns:r="http://schemas.openxmlformats.org/officeDocument/2006/relationships" xmlns:wp14="http://schemas.microsoft.com/office/word/2010/wordprocessingDrawing" xmlns:wp="http://schemas.openxmlformats.org/drawingml/2006/wordprocessingDrawing" xmlns:wpg="http://schemas.microsoft.com/office/word/2010/wordprocessingGroup" xmlns:wpi="http://schemas.microsoft.com/office/word/2010/wordprocessingInk" xmlns:wps="http://schemas.microsoft.com/office/word/2010/wordprocessingShape" xmlns:o="urn:schemas-microsoft-com:office:office" xmlns:v="urn:schemas-microsoft-com:vml" xmlns:w10="urn:schemas-microsoft-com:office:word" xmlns:w="http://schemas.openxmlformats.org/wordprocessingml/2006/main" xmlns:w14="http://schemas.microsoft.com/office/word/2010/wordml" xmlns:w15="http://schemas.microsoft.com/office/word/2012/wordml" xmlns:w16cei="http://schemas.microsoft.com/office/word/2026/wordml/cei" xmlns:w16cex="http://schemas.microsoft.com/office/word/2018/wordml/cex" xmlns:w16cid="http://schemas.microsoft.com/office/word/2016/wordml/cid" xmlns:w16="http://schemas.microsoft.com/office/word/2018/wordml" xmlns:w16sdtdh="http://schemas.microsoft.com/office/word/2020/wordml/sdtdatahash" xmlns:w16sdtfl="http://schemas.microsoft.com/office/word/2024/wordml/sdtformatlock" xmlns:w16se="http://schemas.microsoft.com/office/word/2015/wordml/symex" xmlns:w16du="http://schemas.microsoft.com/office/word/2023/wordml/word16du" xmlns:wne="http://schemas.microsoft.com/office/word/2006/wordml" mc:Ignorable="w14 w15 w16se w16cid w16 w16cex w16sdtdh w16sdtfl w16du wp14">
   <w:p>
     <w:pPr>
       <w:spacing w:after="0" w:line="259" w:lineRule="auto"/>
@@ -3149,7 +3160,7 @@
 </file>
 
 <file path=word/footnotes.xml><?xml version="1.0" encoding="utf-8"?>
-<w:footnotes xmlns:wpc="http://schemas.microsoft.com/office/word/2010/wordprocessingCanvas" xmlns:cx="http://schemas.microsoft.com/office/drawing/2014/chartex" xmlns:cx1="http://schemas.microsoft.com/office/drawing/2015/9/8/chartex" xmlns:cx2="http://schemas.microsoft.com/office/drawing/2015/10/21/chartex" xmlns:cx3="http://schemas.microsoft.com/office/drawing/2016/5/9/chartex" xmlns:cx4="http://schemas.microsoft.com/office/drawing/2016/5/10/chartex" xmlns:cx5="http://schemas.microsoft.com/office/drawing/2016/5/11/chartex" xmlns:cx6="http://schemas.microsoft.com/office/drawing/2016/5/12/chartex" xmlns:cx7="http://schemas.microsoft.com/office/drawing/2016/5/13/chartex" xmlns:cx8="http://schemas.microsoft.com/office/drawing/2016/5/14/chartex" xmlns:mc="http://schemas.openxmlformats.org/markup-compatibility/2006" xmlns:m="http://schemas.openxmlformats.org/officeDocument/2006/math" xmlns:aink="http://schemas.microsoft.com/office/drawing/2016/ink" xmlns:am3d="http://schemas.microsoft.com/office/drawing/2017/model3d" xmlns:oel="http://schemas.microsoft.com/office/2019/extlst" xmlns:r="http://schemas.openxmlformats.org/officeDocument/2006/relationships" xmlns:wp14="http://schemas.microsoft.com/office/word/2010/wordprocessingDrawing" xmlns:wp="http://schemas.openxmlformats.org/drawingml/2006/wordprocessingDrawing" xmlns:wpg="http://schemas.microsoft.com/office/word/2010/wordprocessingGroup" xmlns:wpi="http://schemas.microsoft.com/office/word/2010/wordprocessingInk" xmlns:wps="http://schemas.microsoft.com/office/word/2010/wordprocessingShape" xmlns:o="urn:schemas-microsoft-com:office:office" xmlns:v="urn:schemas-microsoft-com:vml" xmlns:w10="urn:schemas-microsoft-com:office:word" xmlns:w="http://schemas.openxmlformats.org/wordprocessingml/2006/main" xmlns:w14="http://schemas.microsoft.com/office/word/2010/wordml" xmlns:w15="http://schemas.microsoft.com/office/word/2012/wordml" xmlns:w16cex="http://schemas.microsoft.com/office/word/2018/wordml/cex" xmlns:w16cid="http://schemas.microsoft.com/office/word/2016/wordml/cid" xmlns:w16="http://schemas.microsoft.com/office/word/2018/wordml" xmlns:w16sdtdh="http://schemas.microsoft.com/office/word/2020/wordml/sdtdatahash" xmlns:w16sdtfl="http://schemas.microsoft.com/office/word/2024/wordml/sdtformatlock" xmlns:w16se="http://schemas.microsoft.com/office/word/2015/wordml/symex" xmlns:w16du="http://schemas.microsoft.com/office/word/2023/wordml/word16du" xmlns:wne="http://schemas.microsoft.com/office/word/2006/wordml" mc:Ignorable="w14 w15 w16se w16cid w16 w16cex w16sdtdh w16sdtfl w16du wp14">
+<w:footnotes xmlns:wpc="http://schemas.microsoft.com/office/word/2010/wordprocessingCanvas" xmlns:cx="http://schemas.microsoft.com/office/drawing/2014/chartex" xmlns:cx1="http://schemas.microsoft.com/office/drawing/2015/9/8/chartex" xmlns:cx2="http://schemas.microsoft.com/office/drawing/2015/10/21/chartex" xmlns:cx3="http://schemas.microsoft.com/office/drawing/2016/5/9/chartex" xmlns:cx4="http://schemas.microsoft.com/office/drawing/2016/5/10/chartex" xmlns:cx5="http://schemas.microsoft.com/office/drawing/2016/5/11/chartex" xmlns:cx6="http://schemas.microsoft.com/office/drawing/2016/5/12/chartex" xmlns:cx7="http://schemas.microsoft.com/office/drawing/2016/5/13/chartex" xmlns:cx8="http://schemas.microsoft.com/office/drawing/2016/5/14/chartex" xmlns:mc="http://schemas.openxmlformats.org/markup-compatibility/2006" xmlns:m="http://schemas.openxmlformats.org/officeDocument/2006/math" xmlns:aink="http://schemas.microsoft.com/office/drawing/2016/ink" xmlns:am3d="http://schemas.microsoft.com/office/drawing/2017/model3d" xmlns:oel="http://schemas.microsoft.com/office/2019/extlst" xmlns:r="http://schemas.openxmlformats.org/officeDocument/2006/relationships" xmlns:wp14="http://schemas.microsoft.com/office/word/2010/wordprocessingDrawing" xmlns:wp="http://schemas.openxmlformats.org/drawingml/2006/wordprocessingDrawing" xmlns:wpg="http://schemas.microsoft.com/office/word/2010/wordprocessingGroup" xmlns:wpi="http://schemas.microsoft.com/office/word/2010/wordprocessingInk" xmlns:wps="http://schemas.microsoft.com/office/word/2010/wordprocessingShape" xmlns:o="urn:schemas-microsoft-com:office:office" xmlns:v="urn:schemas-microsoft-com:vml" xmlns:w10="urn:schemas-microsoft-com:office:word" xmlns:w="http://schemas.openxmlformats.org/wordprocessingml/2006/main" xmlns:w14="http://schemas.microsoft.com/office/word/2010/wordml" xmlns:w15="http://schemas.microsoft.com/office/word/2012/wordml" xmlns:w16cei="http://schemas.microsoft.com/office/word/2026/wordml/cei" xmlns:w16cex="http://schemas.microsoft.com/office/word/2018/wordml/cex" xmlns:w16cid="http://schemas.microsoft.com/office/word/2016/wordml/cid" xmlns:w16="http://schemas.microsoft.com/office/word/2018/wordml" xmlns:w16sdtdh="http://schemas.microsoft.com/office/word/2020/wordml/sdtdatahash" xmlns:w16sdtfl="http://schemas.microsoft.com/office/word/2024/wordml/sdtformatlock" xmlns:w16se="http://schemas.microsoft.com/office/word/2015/wordml/symex" xmlns:w16du="http://schemas.microsoft.com/office/word/2023/wordml/word16du" xmlns:wne="http://schemas.microsoft.com/office/word/2006/wordml" mc:Ignorable="w14 w15 w16se w16cid w16 w16cex w16sdtdh w16sdtfl w16du wp14">
   <w:footnote w:type="separator" w:id="-1">
     <w:p>
       <w:pPr>
@@ -3174,7 +3185,7 @@
 </file>
 
 <file path=word/header1.xml><?xml version="1.0" encoding="utf-8"?>
-<w:hdr xmlns:wpc="http://schemas.microsoft.com/office/word/2010/wordprocessingCanvas" xmlns:cx="http://schemas.microsoft.com/office/drawing/2014/chartex" xmlns:cx1="http://schemas.microsoft.com/office/drawing/2015/9/8/chartex" xmlns:cx2="http://schemas.microsoft.com/office/drawing/2015/10/21/chartex" xmlns:cx3="http://schemas.microsoft.com/office/drawing/2016/5/9/chartex" xmlns:cx4="http://schemas.microsoft.com/office/drawing/2016/5/10/chartex" xmlns:cx5="http://schemas.microsoft.com/office/drawing/2016/5/11/chartex" xmlns:cx6="http://schemas.microsoft.com/office/drawing/2016/5/12/chartex" xmlns:cx7="http://schemas.microsoft.com/office/drawing/2016/5/13/chartex" xmlns:cx8="http://schemas.microsoft.com/office/drawing/2016/5/14/chartex" xmlns:mc="http://schemas.openxmlformats.org/markup-compatibility/2006" xmlns:m="http://schemas.openxmlformats.org/officeDocument/2006/math" xmlns:aink="http://schemas.microsoft.com/office/drawing/2016/ink" xmlns:am3d="http://schemas.microsoft.com/office/drawing/2017/model3d" xmlns:oel="http://schemas.microsoft.com/office/2019/extlst" xmlns:r="http://schemas.openxmlformats.org/officeDocument/2006/relationships" xmlns:wp14="http://schemas.microsoft.com/office/word/2010/wordprocessingDrawing" xmlns:wp="http://schemas.openxmlformats.org/drawingml/2006/wordprocessingDrawing" xmlns:wpg="http://schemas.microsoft.com/office/word/2010/wordprocessingGroup" xmlns:wpi="http://schemas.microsoft.com/office/word/2010/wordprocessingInk" xmlns:wps="http://schemas.microsoft.com/office/word/2010/wordprocessingShape" xmlns:o="urn:schemas-microsoft-com:office:office" xmlns:v="urn:schemas-microsoft-com:vml" xmlns:w10="urn:schemas-microsoft-com:office:word" xmlns:w="http://schemas.openxmlformats.org/wordprocessingml/2006/main" xmlns:w14="http://schemas.microsoft.com/office/word/2010/wordml" xmlns:w15="http://schemas.microsoft.com/office/word/2012/wordml" xmlns:w16cex="http://schemas.microsoft.com/office/word/2018/wordml/cex" xmlns:w16cid="http://schemas.microsoft.com/office/word/2016/wordml/cid" xmlns:w16="http://schemas.microsoft.com/office/word/2018/wordml" xmlns:w16sdtdh="http://schemas.microsoft.com/office/word/2020/wordml/sdtdatahash" xmlns:w16sdtfl="http://schemas.microsoft.com/office/word/2024/wordml/sdtformatlock" xmlns:w16se="http://schemas.microsoft.com/office/word/2015/wordml/symex" xmlns:w16du="http://schemas.microsoft.com/office/word/2023/wordml/word16du" xmlns:wne="http://schemas.microsoft.com/office/word/2006/wordml" mc:Ignorable="w14 w15 w16se w16cid w16 w16cex w16sdtdh w16sdtfl w16du wp14">
+<w:hdr xmlns:wpc="http://schemas.microsoft.com/office/word/2010/wordprocessingCanvas" xmlns:cx="http://schemas.microsoft.com/office/drawing/2014/chartex" xmlns:cx1="http://schemas.microsoft.com/office/drawing/2015/9/8/chartex" xmlns:cx2="http://schemas.microsoft.com/office/drawing/2015/10/21/chartex" xmlns:cx3="http://schemas.microsoft.com/office/drawing/2016/5/9/chartex" xmlns:cx4="http://schemas.microsoft.com/office/drawing/2016/5/10/chartex" xmlns:cx5="http://schemas.microsoft.com/office/drawing/2016/5/11/chartex" xmlns:cx6="http://schemas.microsoft.com/office/drawing/2016/5/12/chartex" xmlns:cx7="http://schemas.microsoft.com/office/drawing/2016/5/13/chartex" xmlns:cx8="http://schemas.microsoft.com/office/drawing/2016/5/14/chartex" xmlns:mc="http://schemas.openxmlformats.org/markup-compatibility/2006" xmlns:m="http://schemas.openxmlformats.org/officeDocument/2006/math" xmlns:aink="http://schemas.microsoft.com/office/drawing/2016/ink" xmlns:am3d="http://schemas.microsoft.com/office/drawing/2017/model3d" xmlns:oel="http://schemas.microsoft.com/office/2019/extlst" xmlns:r="http://schemas.openxmlformats.org/officeDocument/2006/relationships" xmlns:wp14="http://schemas.microsoft.com/office/word/2010/wordprocessingDrawing" xmlns:wp="http://schemas.openxmlformats.org/drawingml/2006/wordprocessingDrawing" xmlns:wpg="http://schemas.microsoft.com/office/word/2010/wordprocessingGroup" xmlns:wpi="http://schemas.microsoft.com/office/word/2010/wordprocessingInk" xmlns:wps="http://schemas.microsoft.com/office/word/2010/wordprocessingShape" xmlns:o="urn:schemas-microsoft-com:office:office" xmlns:v="urn:schemas-microsoft-com:vml" xmlns:w10="urn:schemas-microsoft-com:office:word" xmlns:w="http://schemas.openxmlformats.org/wordprocessingml/2006/main" xmlns:w14="http://schemas.microsoft.com/office/word/2010/wordml" xmlns:w15="http://schemas.microsoft.com/office/word/2012/wordml" xmlns:w16cei="http://schemas.microsoft.com/office/word/2026/wordml/cei" xmlns:w16cex="http://schemas.microsoft.com/office/word/2018/wordml/cex" xmlns:w16cid="http://schemas.microsoft.com/office/word/2016/wordml/cid" xmlns:w16="http://schemas.microsoft.com/office/word/2018/wordml" xmlns:w16sdtdh="http://schemas.microsoft.com/office/word/2020/wordml/sdtdatahash" xmlns:w16sdtfl="http://schemas.microsoft.com/office/word/2024/wordml/sdtformatlock" xmlns:w16se="http://schemas.microsoft.com/office/word/2015/wordml/symex" xmlns:w16du="http://schemas.microsoft.com/office/word/2023/wordml/word16du" xmlns:wne="http://schemas.microsoft.com/office/word/2006/wordml" mc:Ignorable="w14 w15 w16se w16cid w16 w16cex w16sdtdh w16sdtfl w16du wp14">
   <w:p>
     <w:pPr>
       <w:spacing w:after="0" w:line="259" w:lineRule="auto"/>
@@ -3411,7 +3422,7 @@
 </file>
 
 <file path=word/header2.xml><?xml version="1.0" encoding="utf-8"?>
-<w:hdr xmlns:wpc="http://schemas.microsoft.com/office/word/2010/wordprocessingCanvas" xmlns:cx="http://schemas.microsoft.com/office/drawing/2014/chartex" xmlns:cx1="http://schemas.microsoft.com/office/drawing/2015/9/8/chartex" xmlns:cx2="http://schemas.microsoft.com/office/drawing/2015/10/21/chartex" xmlns:cx3="http://schemas.microsoft.com/office/drawing/2016/5/9/chartex" xmlns:cx4="http://schemas.microsoft.com/office/drawing/2016/5/10/chartex" xmlns:cx5="http://schemas.microsoft.com/office/drawing/2016/5/11/chartex" xmlns:cx6="http://schemas.microsoft.com/office/drawing/2016/5/12/chartex" xmlns:cx7="http://schemas.microsoft.com/office/drawing/2016/5/13/chartex" xmlns:cx8="http://schemas.microsoft.com/office/drawing/2016/5/14/chartex" xmlns:mc="http://schemas.openxmlformats.org/markup-compatibility/2006" xmlns:m="http://schemas.openxmlformats.org/officeDocument/2006/math" xmlns:aink="http://schemas.microsoft.com/office/drawing/2016/ink" xmlns:am3d="http://schemas.microsoft.com/office/drawing/2017/model3d" xmlns:oel="http://schemas.microsoft.com/office/2019/extlst" xmlns:r="http://schemas.openxmlformats.org/officeDocument/2006/relationships" xmlns:wp14="http://schemas.microsoft.com/office/word/2010/wordprocessingDrawing" xmlns:wp="http://schemas.openxmlformats.org/drawingml/2006/wordprocessingDrawing" xmlns:wpg="http://schemas.microsoft.com/office/word/2010/wordprocessingGroup" xmlns:wpi="http://schemas.microsoft.com/office/word/2010/wordprocessingInk" xmlns:wps="http://schemas.microsoft.com/office/word/2010/wordprocessingShape" xmlns:o="urn:schemas-microsoft-com:office:office" xmlns:v="urn:schemas-microsoft-com:vml" xmlns:w10="urn:schemas-microsoft-com:office:word" xmlns:w="http://schemas.openxmlformats.org/wordprocessingml/2006/main" xmlns:w14="http://schemas.microsoft.com/office/word/2010/wordml" xmlns:w15="http://schemas.microsoft.com/office/word/2012/wordml" xmlns:w16cex="http://schemas.microsoft.com/office/word/2018/wordml/cex" xmlns:w16cid="http://schemas.microsoft.com/office/word/2016/wordml/cid" xmlns:w16="http://schemas.microsoft.com/office/word/2018/wordml" xmlns:w16sdtdh="http://schemas.microsoft.com/office/word/2020/wordml/sdtdatahash" xmlns:w16sdtfl="http://schemas.microsoft.com/office/word/2024/wordml/sdtformatlock" xmlns:w16se="http://schemas.microsoft.com/office/word/2015/wordml/symex" xmlns:w16du="http://schemas.microsoft.com/office/word/2023/wordml/word16du" xmlns:wne="http://schemas.microsoft.com/office/word/2006/wordml" mc:Ignorable="w14 w15 w16se w16cid w16 w16cex w16sdtdh w16sdtfl w16du wp14">
+<w:hdr xmlns:wpc="http://schemas.microsoft.com/office/word/2010/wordprocessingCanvas" xmlns:cx="http://schemas.microsoft.com/office/drawing/2014/chartex" xmlns:cx1="http://schemas.microsoft.com/office/drawing/2015/9/8/chartex" xmlns:cx2="http://schemas.microsoft.com/office/drawing/2015/10/21/chartex" xmlns:cx3="http://schemas.microsoft.com/office/drawing/2016/5/9/chartex" xmlns:cx4="http://schemas.microsoft.com/office/drawing/2016/5/10/chartex" xmlns:cx5="http://schemas.microsoft.com/office/drawing/2016/5/11/chartex" xmlns:cx6="http://schemas.microsoft.com/office/drawing/2016/5/12/chartex" xmlns:cx7="http://schemas.microsoft.com/office/drawing/2016/5/13/chartex" xmlns:cx8="http://schemas.microsoft.com/office/drawing/2016/5/14/chartex" xmlns:mc="http://schemas.openxmlformats.org/markup-compatibility/2006" xmlns:m="http://schemas.openxmlformats.org/officeDocument/2006/math" xmlns:aink="http://schemas.microsoft.com/office/drawing/2016/ink" xmlns:am3d="http://schemas.microsoft.com/office/drawing/2017/model3d" xmlns:oel="http://schemas.microsoft.com/office/2019/extlst" xmlns:r="http://schemas.openxmlformats.org/officeDocument/2006/relationships" xmlns:wp14="http://schemas.microsoft.com/office/word/2010/wordprocessingDrawing" xmlns:wp="http://schemas.openxmlformats.org/drawingml/2006/wordprocessingDrawing" xmlns:wpg="http://schemas.microsoft.com/office/word/2010/wordprocessingGroup" xmlns:wpi="http://schemas.microsoft.com/office/word/2010/wordprocessingInk" xmlns:wps="http://schemas.microsoft.com/office/word/2010/wordprocessingShape" xmlns:o="urn:schemas-microsoft-com:office:office" xmlns:v="urn:schemas-microsoft-com:vml" xmlns:w10="urn:schemas-microsoft-com:office:word" xmlns:w="http://schemas.openxmlformats.org/wordprocessingml/2006/main" xmlns:w14="http://schemas.microsoft.com/office/word/2010/wordml" xmlns:w15="http://schemas.microsoft.com/office/word/2012/wordml" xmlns:w16cei="http://schemas.microsoft.com/office/word/2026/wordml/cei" xmlns:w16cex="http://schemas.microsoft.com/office/word/2018/wordml/cex" xmlns:w16cid="http://schemas.microsoft.com/office/word/2016/wordml/cid" xmlns:w16="http://schemas.microsoft.com/office/word/2018/wordml" xmlns:w16sdtdh="http://schemas.microsoft.com/office/word/2020/wordml/sdtdatahash" xmlns:w16sdtfl="http://schemas.microsoft.com/office/word/2024/wordml/sdtformatlock" xmlns:w16se="http://schemas.microsoft.com/office/word/2015/wordml/symex" xmlns:w16du="http://schemas.microsoft.com/office/word/2023/wordml/word16du" xmlns:wne="http://schemas.microsoft.com/office/word/2006/wordml" mc:Ignorable="w14 w15 w16se w16cid w16 w16cex w16sdtdh w16sdtfl w16du wp14">
   <w:p>
     <w:pPr>
       <w:spacing w:after="0" w:line="259" w:lineRule="auto"/>
@@ -3648,7 +3659,7 @@
 </file>
 
 <file path=word/header3.xml><?xml version="1.0" encoding="utf-8"?>
-<w:hdr xmlns:wpc="http://schemas.microsoft.com/office/word/2010/wordprocessingCanvas" xmlns:cx="http://schemas.microsoft.com/office/drawing/2014/chartex" xmlns:cx1="http://schemas.microsoft.com/office/drawing/2015/9/8/chartex" xmlns:cx2="http://schemas.microsoft.com/office/drawing/2015/10/21/chartex" xmlns:cx3="http://schemas.microsoft.com/office/drawing/2016/5/9/chartex" xmlns:cx4="http://schemas.microsoft.com/office/drawing/2016/5/10/chartex" xmlns:cx5="http://schemas.microsoft.com/office/drawing/2016/5/11/chartex" xmlns:cx6="http://schemas.microsoft.com/office/drawing/2016/5/12/chartex" xmlns:cx7="http://schemas.microsoft.com/office/drawing/2016/5/13/chartex" xmlns:cx8="http://schemas.microsoft.com/office/drawing/2016/5/14/chartex" xmlns:mc="http://schemas.openxmlformats.org/markup-compatibility/2006" xmlns:m="http://schemas.openxmlformats.org/officeDocument/2006/math" xmlns:aink="http://schemas.microsoft.com/office/drawing/2016/ink" xmlns:am3d="http://schemas.microsoft.com/office/drawing/2017/model3d" xmlns:oel="http://schemas.microsoft.com/office/2019/extlst" xmlns:r="http://schemas.openxmlformats.org/officeDocument/2006/relationships" xmlns:wp14="http://schemas.microsoft.com/office/word/2010/wordprocessingDrawing" xmlns:wp="http://schemas.openxmlformats.org/drawingml/2006/wordprocessingDrawing" xmlns:wpg="http://schemas.microsoft.com/office/word/2010/wordprocessingGroup" xmlns:wpi="http://schemas.microsoft.com/office/word/2010/wordprocessingInk" xmlns:wps="http://schemas.microsoft.com/office/word/2010/wordprocessingShape" xmlns:o="urn:schemas-microsoft-com:office:office" xmlns:v="urn:schemas-microsoft-com:vml" xmlns:w10="urn:schemas-microsoft-com:office:word" xmlns:w="http://schemas.openxmlformats.org/wordprocessingml/2006/main" xmlns:w14="http://schemas.microsoft.com/office/word/2010/wordml" xmlns:w15="http://schemas.microsoft.com/office/word/2012/wordml" xmlns:w16cex="http://schemas.microsoft.com/office/word/2018/wordml/cex" xmlns:w16cid="http://schemas.microsoft.com/office/word/2016/wordml/cid" xmlns:w16="http://schemas.microsoft.com/office/word/2018/wordml" xmlns:w16sdtdh="http://schemas.microsoft.com/office/word/2020/wordml/sdtdatahash" xmlns:w16sdtfl="http://schemas.microsoft.com/office/word/2024/wordml/sdtformatlock" xmlns:w16se="http://schemas.microsoft.com/office/word/2015/wordml/symex" xmlns:w16du="http://schemas.microsoft.com/office/word/2023/wordml/word16du" xmlns:wne="http://schemas.microsoft.com/office/word/2006/wordml" mc:Ignorable="w14 w15 w16se w16cid w16 w16cex w16sdtdh w16sdtfl w16du wp14">
+<w:hdr xmlns:wpc="http://schemas.microsoft.com/office/word/2010/wordprocessingCanvas" xmlns:cx="http://schemas.microsoft.com/office/drawing/2014/chartex" xmlns:cx1="http://schemas.microsoft.com/office/drawing/2015/9/8/chartex" xmlns:cx2="http://schemas.microsoft.com/office/drawing/2015/10/21/chartex" xmlns:cx3="http://schemas.microsoft.com/office/drawing/2016/5/9/chartex" xmlns:cx4="http://schemas.microsoft.com/office/drawing/2016/5/10/chartex" xmlns:cx5="http://schemas.microsoft.com/office/drawing/2016/5/11/chartex" xmlns:cx6="http://schemas.microsoft.com/office/drawing/2016/5/12/chartex" xmlns:cx7="http://schemas.microsoft.com/office/drawing/2016/5/13/chartex" xmlns:cx8="http://schemas.microsoft.com/office/drawing/2016/5/14/chartex" xmlns:mc="http://schemas.openxmlformats.org/markup-compatibility/2006" xmlns:m="http://schemas.openxmlformats.org/officeDocument/2006/math" xmlns:aink="http://schemas.microsoft.com/office/drawing/2016/ink" xmlns:am3d="http://schemas.microsoft.com/office/drawing/2017/model3d" xmlns:oel="http://schemas.microsoft.com/office/2019/extlst" xmlns:r="http://schemas.openxmlformats.org/officeDocument/2006/relationships" xmlns:wp14="http://schemas.microsoft.com/office/word/2010/wordprocessingDrawing" xmlns:wp="http://schemas.openxmlformats.org/drawingml/2006/wordprocessingDrawing" xmlns:wpg="http://schemas.microsoft.com/office/word/2010/wordprocessingGroup" xmlns:wpi="http://schemas.microsoft.com/office/word/2010/wordprocessingInk" xmlns:wps="http://schemas.microsoft.com/office/word/2010/wordprocessingShape" xmlns:o="urn:schemas-microsoft-com:office:office" xmlns:v="urn:schemas-microsoft-com:vml" xmlns:w10="urn:schemas-microsoft-com:office:word" xmlns:w="http://schemas.openxmlformats.org/wordprocessingml/2006/main" xmlns:w14="http://schemas.microsoft.com/office/word/2010/wordml" xmlns:w15="http://schemas.microsoft.com/office/word/2012/wordml" xmlns:w16cei="http://schemas.microsoft.com/office/word/2026/wordml/cei" xmlns:w16cex="http://schemas.microsoft.com/office/word/2018/wordml/cex" xmlns:w16cid="http://schemas.microsoft.com/office/word/2016/wordml/cid" xmlns:w16="http://schemas.microsoft.com/office/word/2018/wordml" xmlns:w16sdtdh="http://schemas.microsoft.com/office/word/2020/wordml/sdtdatahash" xmlns:w16sdtfl="http://schemas.microsoft.com/office/word/2024/wordml/sdtformatlock" xmlns:w16se="http://schemas.microsoft.com/office/word/2015/wordml/symex" xmlns:w16du="http://schemas.microsoft.com/office/word/2023/wordml/word16du" xmlns:wne="http://schemas.microsoft.com/office/word/2006/wordml" mc:Ignorable="w14 w15 w16se w16cid w16 w16cex w16sdtdh w16sdtfl w16du wp14">
   <w:p>
     <w:pPr>
       <w:spacing w:after="0" w:line="259" w:lineRule="auto"/>
@@ -3885,7 +3896,7 @@
 </file>
 
 <file path=word/numbering.xml><?xml version="1.0" encoding="utf-8"?>
-<w:numbering xmlns:wpc="http://schemas.microsoft.com/office/word/2010/wordprocessingCanvas" xmlns:cx="http://schemas.microsoft.com/office/drawing/2014/chartex" xmlns:cx1="http://schemas.microsoft.com/office/drawing/2015/9/8/chartex" xmlns:cx2="http://schemas.microsoft.com/office/drawing/2015/10/21/chartex" xmlns:cx3="http://schemas.microsoft.com/office/drawing/2016/5/9/chartex" xmlns:cx4="http://schemas.microsoft.com/office/drawing/2016/5/10/chartex" xmlns:cx5="http://schemas.microsoft.com/office/drawing/2016/5/11/chartex" xmlns:cx6="http://schemas.microsoft.com/office/drawing/2016/5/12/chartex" xmlns:cx7="http://schemas.microsoft.com/office/drawing/2016/5/13/chartex" xmlns:cx8="http://schemas.microsoft.com/office/drawing/2016/5/14/chartex" xmlns:mc="http://schemas.openxmlformats.org/markup-compatibility/2006" xmlns:m="http://schemas.openxmlformats.org/officeDocument/2006/math" xmlns:aink="http://schemas.microsoft.com/office/drawing/2016/ink" xmlns:am3d="http://schemas.microsoft.com/office/drawing/2017/model3d" xmlns:oel="http://schemas.microsoft.com/office/2019/extlst" xmlns:r="http://schemas.openxmlformats.org/officeDocument/2006/relationships" xmlns:wp14="http://schemas.microsoft.com/office/word/2010/wordprocessingDrawing" xmlns:wp="http://schemas.openxmlformats.org/drawingml/2006/wordprocessingDrawing" xmlns:wpg="http://schemas.microsoft.com/office/word/2010/wordprocessingGroup" xmlns:wpi="http://schemas.microsoft.com/office/word/2010/wordprocessingInk" xmlns:wps="http://schemas.microsoft.com/office/word/2010/wordprocessingShape" xmlns:o="urn:schemas-microsoft-com:office:office" xmlns:v="urn:schemas-microsoft-com:vml" xmlns:w10="urn:schemas-microsoft-com:office:word" xmlns:w="http://schemas.openxmlformats.org/wordprocessingml/2006/main" xmlns:w14="http://schemas.microsoft.com/office/word/2010/wordml" xmlns:w15="http://schemas.microsoft.com/office/word/2012/wordml" xmlns:w16cex="http://schemas.microsoft.com/office/word/2018/wordml/cex" xmlns:w16cid="http://schemas.microsoft.com/office/word/2016/wordml/cid" xmlns:w16="http://schemas.microsoft.com/office/word/2018/wordml" xmlns:w16sdtdh="http://schemas.microsoft.com/office/word/2020/wordml/sdtdatahash" xmlns:w16sdtfl="http://schemas.microsoft.com/office/word/2024/wordml/sdtformatlock" xmlns:w16se="http://schemas.microsoft.com/office/word/2015/wordml/symex" xmlns:w16du="http://schemas.microsoft.com/office/word/2023/wordml/word16du" xmlns:wne="http://schemas.microsoft.com/office/word/2006/wordml" mc:Ignorable="w14 w15 w16se w16cid w16 w16cex w16sdtdh w16sdtfl w16du wp14">
+<w:numbering xmlns:wpc="http://schemas.microsoft.com/office/word/2010/wordprocessingCanvas" xmlns:cx="http://schemas.microsoft.com/office/drawing/2014/chartex" xmlns:cx1="http://schemas.microsoft.com/office/drawing/2015/9/8/chartex" xmlns:cx2="http://schemas.microsoft.com/office/drawing/2015/10/21/chartex" xmlns:cx3="http://schemas.microsoft.com/office/drawing/2016/5/9/chartex" xmlns:cx4="http://schemas.microsoft.com/office/drawing/2016/5/10/chartex" xmlns:cx5="http://schemas.microsoft.com/office/drawing/2016/5/11/chartex" xmlns:cx6="http://schemas.microsoft.com/office/drawing/2016/5/12/chartex" xmlns:cx7="http://schemas.microsoft.com/office/drawing/2016/5/13/chartex" xmlns:cx8="http://schemas.microsoft.com/office/drawing/2016/5/14/chartex" xmlns:mc="http://schemas.openxmlformats.org/markup-compatibility/2006" xmlns:m="http://schemas.openxmlformats.org/officeDocument/2006/math" xmlns:aink="http://schemas.microsoft.com/office/drawing/2016/ink" xmlns:am3d="http://schemas.microsoft.com/office/drawing/2017/model3d" xmlns:oel="http://schemas.microsoft.com/office/2019/extlst" xmlns:r="http://schemas.openxmlformats.org/officeDocument/2006/relationships" xmlns:wp14="http://schemas.microsoft.com/office/word/2010/wordprocessingDrawing" xmlns:wp="http://schemas.openxmlformats.org/drawingml/2006/wordprocessingDrawing" xmlns:wpg="http://schemas.microsoft.com/office/word/2010/wordprocessingGroup" xmlns:wpi="http://schemas.microsoft.com/office/word/2010/wordprocessingInk" xmlns:wps="http://schemas.microsoft.com/office/word/2010/wordprocessingShape" xmlns:o="urn:schemas-microsoft-com:office:office" xmlns:v="urn:schemas-microsoft-com:vml" xmlns:w10="urn:schemas-microsoft-com:office:word" xmlns:w="http://schemas.openxmlformats.org/wordprocessingml/2006/main" xmlns:w14="http://schemas.microsoft.com/office/word/2010/wordml" xmlns:w15="http://schemas.microsoft.com/office/word/2012/wordml" xmlns:w16cei="http://schemas.microsoft.com/office/word/2026/wordml/cei" xmlns:w16cex="http://schemas.microsoft.com/office/word/2018/wordml/cex" xmlns:w16cid="http://schemas.microsoft.com/office/word/2016/wordml/cid" xmlns:w16="http://schemas.microsoft.com/office/word/2018/wordml" xmlns:w16sdtdh="http://schemas.microsoft.com/office/word/2020/wordml/sdtdatahash" xmlns:w16sdtfl="http://schemas.microsoft.com/office/word/2024/wordml/sdtformatlock" xmlns:w16se="http://schemas.microsoft.com/office/word/2015/wordml/symex" xmlns:w16du="http://schemas.microsoft.com/office/word/2023/wordml/word16du" xmlns:wne="http://schemas.microsoft.com/office/word/2006/wordml" mc:Ignorable="w14 w15 w16se w16cid w16 w16cex w16sdtdh w16sdtfl w16du wp14">
   <w:abstractNum w:abstractNumId="0" w15:restartNumberingAfterBreak="0">
     <w:nsid w:val="0B4F0806"/>
     <w:multiLevelType w:val="hybridMultilevel"/>
@@ -4603,13 +4614,13 @@
       <w:color w:val="000000"/>
     </w:rPr>
   </w:style>
-  <w:style w:type="character" w:default="1" w:styleId="DefaultParagraphFont">
+  <w:style w:type="character" w:default="1" w:styleId="Fuentedeprrafopredeter">
     <w:name w:val="Default Paragraph Font"/>
     <w:uiPriority w:val="1"/>
     <w:semiHidden/>
     <w:unhideWhenUsed/>
   </w:style>
-  <w:style w:type="table" w:default="1" w:styleId="TableNormal">
+  <w:style w:type="table" w:default="1" w:styleId="Tablanormal">
     <w:name w:val="Normal Table"/>
     <w:uiPriority w:val="99"/>
     <w:semiHidden/>
@@ -4624,16 +4635,16 @@
       </w:tblCellMar>
     </w:tblPr>
   </w:style>
-  <w:style w:type="numbering" w:default="1" w:styleId="NoList">
+  <w:style w:type="numbering" w:default="1" w:styleId="Sinlista">
     <w:name w:val="No List"/>
     <w:uiPriority w:val="99"/>
     <w:semiHidden/>
     <w:unhideWhenUsed/>
   </w:style>
-  <w:style w:type="paragraph" w:styleId="BodyText">
+  <w:style w:type="paragraph" w:styleId="Textoindependiente">
     <w:name w:val="Body Text"/>
     <w:basedOn w:val="Normal"/>
-    <w:link w:val="BodyTextChar"/>
+    <w:link w:val="TextoindependienteCar"/>
     <w:uiPriority w:val="1"/>
     <w:qFormat/>
     <w:rsid w:val="007E482A"/>
@@ -4653,10 +4664,10 @@
       <w14:ligatures w14:val="none"/>
     </w:rPr>
   </w:style>
-  <w:style w:type="character" w:customStyle="1" w:styleId="BodyTextChar">
-    <w:name w:val="Body Text Char"/>
-    <w:basedOn w:val="DefaultParagraphFont"/>
-    <w:link w:val="BodyText"/>
+  <w:style w:type="character" w:customStyle="1" w:styleId="TextoindependienteCar">
+    <w:name w:val="Texto independiente Car"/>
+    <w:basedOn w:val="Fuentedeprrafopredeter"/>
+    <w:link w:val="Textoindependiente"/>
     <w:uiPriority w:val="1"/>
     <w:rsid w:val="007E482A"/>
     <w:rPr>
@@ -4666,7 +4677,7 @@
       <w14:ligatures w14:val="none"/>
     </w:rPr>
   </w:style>
-  <w:style w:type="paragraph" w:styleId="ListParagraph">
+  <w:style w:type="paragraph" w:styleId="Prrafodelista">
     <w:name w:val="List Paragraph"/>
     <w:basedOn w:val="Normal"/>
     <w:uiPriority w:val="34"/>

</xml_diff>

<commit_message>
feat: enhance contract management with Word document editing and downloading
Added functionality for downloading contracts as Word documents and editing them directly within the application. Introduced a new modal for Word editing, allowing users to modify contract details seamlessly. Updated the contracts page to include buttons for downloading and editing Word files, improving user experience and accessibility. Enhanced the styling of contract-related components to ensure consistency and clarity. Verified the new features across various scenarios to ensure reliability and performance.
</commit_message>
<xml_diff>
--- a/apps/web/assets/contracts/default-contract-template.docx
+++ b/apps/web/assets/contracts/default-contract-template.docx
@@ -1951,16 +1951,15 @@
     </w:p>
     <w:p>
       <w:pPr>
+        <w:spacing w:after="160" w:line="278" w:lineRule="auto"/>
         <w:ind w:left="0" w:firstLine="0"/>
-      </w:pPr>
-    </w:p>
-    <w:p>
-      <w:pPr>
-        <w:ind w:left="550"/>
-      </w:pPr>
-      <w:r>
-        <w:t xml:space="preserve"> </w:t>
-      </w:r>
+        <w:jc w:val="left"/>
+      </w:pPr>
+    </w:p>
+    <w:p>
+      <w:pPr>
+        <w:ind w:left="0" w:firstLine="0"/>
+      </w:pPr>
     </w:p>
     <w:p>
       <w:pPr>
@@ -2090,6 +2089,16 @@
     </w:p>
     <w:p>
       <w:pPr>
+        <w:spacing w:after="160" w:line="278" w:lineRule="auto"/>
+        <w:ind w:left="0" w:firstLine="0"/>
+        <w:jc w:val="left"/>
+      </w:pPr>
+      <w:r>
+        <w:br w:type="page"/>
+      </w:r>
+    </w:p>
+    <w:p>
+      <w:pPr>
         <w:pStyle w:val="Prrafodelista"/>
         <w:numPr>
           <w:ilvl w:val="0"/>
@@ -2097,6 +2106,7 @@
         </w:numPr>
       </w:pPr>
       <w:r>
+        <w:lastRenderedPageBreak/>
         <w:t xml:space="preserve">No es permitido el ingreso de buses o </w:t>
       </w:r>
       <w:proofErr w:type="spellStart"/>
@@ -2295,7 +2305,6 @@
         </w:numPr>
       </w:pPr>
       <w:r>
-        <w:lastRenderedPageBreak/>
         <w:t xml:space="preserve">El arrendador y sus acompañantes dispondrán de todas las instalaciones de la propiedad  </w:t>
       </w:r>
     </w:p>
@@ -2344,7 +2353,11 @@
         </w:numPr>
       </w:pPr>
       <w:r>
-        <w:t xml:space="preserve">En caso de haber afectación vial problemas de orden público razones de fuerza mayor como desastres naturales que no permitan el desplazamiento al lugar de destino, para ello 15 días previos a este contrato se evaluará la situación y así determinar si procede a una postergación de reserva o cancelación de la misma; En caso de generarse cancelación por alguna de las anteriores, esté NO podrá ser mayor a 14 días previos al inicio de este contrato.  </w:t>
+        <w:t xml:space="preserve">En caso de haber afectación vial problemas de orden público razones de fuerza mayor como desastres naturales que no permitan el desplazamiento al lugar de destino, para ello 15 días previos a este contrato se evaluará la situación y así determinar si procede a una postergación de reserva o cancelación de la misma; En caso </w:t>
+      </w:r>
+      <w:r>
+        <w:lastRenderedPageBreak/>
+        <w:t xml:space="preserve">de generarse cancelación por alguna de las anteriores, esté NO podrá ser mayor a 14 días previos al inicio de este contrato.  </w:t>
       </w:r>
     </w:p>
     <w:p>
@@ -2514,82 +2527,82 @@
         <w:t xml:space="preserve"> </w:t>
       </w:r>
       <w:r>
-        <w:t xml:space="preserve">como concepto de fianza, el cual será reintegrado al </w:t>
+        <w:t xml:space="preserve">como concepto de fianza, el cual será reintegrado al momento de terminar el alquiler, o incluso, puede tardar máximo 12/24 horas en ser retornado con las previas deducciones que en su caso procedan.   </w:t>
+      </w:r>
+    </w:p>
+    <w:p>
+      <w:pPr>
+        <w:ind w:left="550"/>
+      </w:pPr>
+      <w:r>
+        <w:t xml:space="preserve">  </w:t>
+      </w:r>
+    </w:p>
+    <w:p>
+      <w:pPr>
+        <w:ind w:left="550"/>
+      </w:pPr>
+      <w:r>
+        <w:t xml:space="preserve"> </w:t>
+      </w:r>
+    </w:p>
+    <w:p>
+      <w:pPr>
+        <w:ind w:left="550"/>
+      </w:pPr>
+      <w:r>
+        <w:rPr>
+          <w:b/>
+        </w:rPr>
+        <w:t>SÉPTIMA.</w:t>
+      </w:r>
+      <w:r>
+        <w:t xml:space="preserve"> - Para cuantas cuestiones se deriven de la interpretación y ejecución del presente contrato, ambas partes se someten a la jurisdicción de los Juzgados y Tribunales de Colombia, renunciando a su fuero propio.  </w:t>
+      </w:r>
+    </w:p>
+    <w:p>
+      <w:pPr>
+        <w:ind w:left="550"/>
+      </w:pPr>
+      <w:r>
+        <w:t xml:space="preserve">Y en prueba de conformidad, ambas partes firman el presente contrato, que se extiende por duplicado, quedando un ejemplar en poder de cada una de ellas.  </w:t>
+      </w:r>
+    </w:p>
+    <w:p>
+      <w:pPr>
+        <w:ind w:left="550"/>
+      </w:pPr>
+      <w:r>
+        <w:rPr>
+          <w:b/>
+        </w:rPr>
+        <w:t xml:space="preserve">  </w:t>
+      </w:r>
+    </w:p>
+    <w:p>
+      <w:pPr>
+        <w:ind w:left="550"/>
+      </w:pPr>
+      <w:r>
+        <w:t xml:space="preserve"> </w:t>
+      </w:r>
+    </w:p>
+    <w:p>
+      <w:pPr>
+        <w:ind w:left="550"/>
+      </w:pPr>
+      <w:r>
+        <w:rPr>
+          <w:b/>
+        </w:rPr>
+        <w:t>OCTAVA.</w:t>
+      </w:r>
+      <w:r>
+        <w:t xml:space="preserve"> - El cliente arrendador se hace responsable del comportamiento de sus acompañantes y exime de cualquier responsabilidad fiscal, penal o judicial al administrador de la finca y propietario por excesos de alcohol </w:t>
       </w:r>
       <w:r>
         <w:lastRenderedPageBreak/>
-        <w:t xml:space="preserve">momento de terminar el alquiler, o incluso, puede tardar máximo 12/24 horas en ser retornado con las previas deducciones que en su caso procedan.   </w:t>
-      </w:r>
-    </w:p>
-    <w:p>
-      <w:pPr>
-        <w:ind w:left="550"/>
-      </w:pPr>
-      <w:r>
-        <w:t xml:space="preserve">  </w:t>
-      </w:r>
-    </w:p>
-    <w:p>
-      <w:pPr>
-        <w:ind w:left="550"/>
-      </w:pPr>
-      <w:r>
-        <w:t xml:space="preserve"> </w:t>
-      </w:r>
-    </w:p>
-    <w:p>
-      <w:pPr>
-        <w:ind w:left="550"/>
-      </w:pPr>
-      <w:r>
-        <w:rPr>
-          <w:b/>
-        </w:rPr>
-        <w:t>SÉPTIMA.</w:t>
-      </w:r>
-      <w:r>
-        <w:t xml:space="preserve"> - Para cuantas cuestiones se deriven de la interpretación y ejecución del presente contrato, ambas partes se someten a la jurisdicción de los Juzgados y Tribunales de Colombia, renunciando a su fuero propio.  </w:t>
-      </w:r>
-    </w:p>
-    <w:p>
-      <w:pPr>
-        <w:ind w:left="550"/>
-      </w:pPr>
-      <w:r>
-        <w:t xml:space="preserve">Y en prueba de conformidad, ambas partes firman el presente contrato, que se extiende por duplicado, quedando un ejemplar en poder de cada una de ellas.  </w:t>
-      </w:r>
-    </w:p>
-    <w:p>
-      <w:pPr>
-        <w:ind w:left="550"/>
-      </w:pPr>
-      <w:r>
-        <w:rPr>
-          <w:b/>
-        </w:rPr>
-        <w:t xml:space="preserve">  </w:t>
-      </w:r>
-    </w:p>
-    <w:p>
-      <w:pPr>
-        <w:ind w:left="550"/>
-      </w:pPr>
-      <w:r>
-        <w:t xml:space="preserve"> </w:t>
-      </w:r>
-    </w:p>
-    <w:p>
-      <w:pPr>
-        <w:ind w:left="550"/>
-      </w:pPr>
-      <w:r>
-        <w:rPr>
-          <w:b/>
-        </w:rPr>
-        <w:t>OCTAVA.</w:t>
-      </w:r>
-      <w:r>
-        <w:t xml:space="preserve"> - El cliente arrendador se hace responsable del comportamiento de sus acompañantes y exime de cualquier responsabilidad fiscal, penal o judicial al administrador de la finca y propietario por excesos de alcohol y/o estupefacientes, comportamientos violentos y/o eventualidades ocasionadas con mala conducta dentro de la finca.  </w:t>
+        <w:t xml:space="preserve">y/o estupefacientes, comportamientos violentos y/o eventualidades ocasionadas con mala conducta dentro de la finca.  </w:t>
       </w:r>
     </w:p>
     <w:p>
@@ -2780,7 +2793,6 @@
         <w:ind w:left="550"/>
       </w:pPr>
       <w:r>
-        <w:lastRenderedPageBreak/>
         <w:t xml:space="preserve">  </w:t>
       </w:r>
     </w:p>

</xml_diff>